<commit_message>
add lesson about noun form
</commit_message>
<xml_diff>
--- a/Vocab_3.docx
+++ b/Vocab_3.docx
@@ -210,8 +210,8 @@
       <w:r>
         <w:drawing>
           <wp:inline distT="0" distB="0" distL="114300" distR="114300">
-            <wp:extent cx="3670935" cy="1627505"/>
-            <wp:effectExtent l="0" t="0" r="1905" b="3175"/>
+            <wp:extent cx="3209925" cy="1423035"/>
+            <wp:effectExtent l="0" t="0" r="5715" b="9525"/>
             <wp:docPr id="1" name="Picture 1"/>
             <wp:cNvGraphicFramePr>
               <a:graphicFrameLocks xmlns:a="http://schemas.openxmlformats.org/drawingml/2006/main" noChangeAspect="1"/>
@@ -234,7 +234,7 @@
                   <pic:spPr>
                     <a:xfrm>
                       <a:off x="0" y="0"/>
-                      <a:ext cx="3670935" cy="1627505"/>
+                      <a:ext cx="3209925" cy="1423035"/>
                     </a:xfrm>
                     <a:prstGeom prst="rect">
                       <a:avLst/>
@@ -270,8 +270,1450 @@
           <w:lang w:val="en-US"/>
         </w:rPr>
       </w:pPr>
+      <w:r>
+        <w:rPr>
+          <w:rFonts w:hint="default"/>
+          <w:lang w:val="en-US"/>
+        </w:rPr>
+        <w:t>Be apt to # have a predisposition to</w:t>
+      </w:r>
+    </w:p>
+    <w:p>
+      <w:pPr>
+        <w:numPr>
+          <w:numId w:val="0"/>
+        </w:numPr>
+        <w:ind w:leftChars="0"/>
+      </w:pPr>
+      <w:r>
+        <w:drawing>
+          <wp:inline distT="0" distB="0" distL="114300" distR="114300">
+            <wp:extent cx="3253740" cy="1946910"/>
+            <wp:effectExtent l="0" t="0" r="7620" b="3810"/>
+            <wp:docPr id="2" name="Picture 2"/>
+            <wp:cNvGraphicFramePr>
+              <a:graphicFrameLocks xmlns:a="http://schemas.openxmlformats.org/drawingml/2006/main" noChangeAspect="1"/>
+            </wp:cNvGraphicFramePr>
+            <a:graphic xmlns:a="http://schemas.openxmlformats.org/drawingml/2006/main">
+              <a:graphicData uri="http://schemas.openxmlformats.org/drawingml/2006/picture">
+                <pic:pic xmlns:pic="http://schemas.openxmlformats.org/drawingml/2006/picture">
+                  <pic:nvPicPr>
+                    <pic:cNvPr id="2" name="Picture 2"/>
+                    <pic:cNvPicPr>
+                      <a:picLocks noChangeAspect="1"/>
+                    </pic:cNvPicPr>
+                  </pic:nvPicPr>
+                  <pic:blipFill>
+                    <a:blip r:embed="rId5"/>
+                    <a:stretch>
+                      <a:fillRect/>
+                    </a:stretch>
+                  </pic:blipFill>
+                  <pic:spPr>
+                    <a:xfrm>
+                      <a:off x="0" y="0"/>
+                      <a:ext cx="3253740" cy="1946910"/>
+                    </a:xfrm>
+                    <a:prstGeom prst="rect">
+                      <a:avLst/>
+                    </a:prstGeom>
+                    <a:noFill/>
+                    <a:ln>
+                      <a:noFill/>
+                    </a:ln>
+                  </pic:spPr>
+                </pic:pic>
+              </a:graphicData>
+            </a:graphic>
+          </wp:inline>
+        </w:drawing>
+      </w:r>
+    </w:p>
+    <w:p>
+      <w:pPr>
+        <w:numPr>
+          <w:numId w:val="0"/>
+        </w:numPr>
+        <w:ind w:leftChars="0"/>
+      </w:pPr>
+    </w:p>
+    <w:p>
+      <w:pPr>
+        <w:numPr>
+          <w:ilvl w:val="0"/>
+          <w:numId w:val="1"/>
+        </w:numPr>
+        <w:ind w:left="0" w:leftChars="0" w:firstLine="0" w:firstLineChars="0"/>
+        <w:rPr>
+          <w:rFonts w:hint="default"/>
+          <w:lang w:val="en-US"/>
+        </w:rPr>
+      </w:pPr>
+      <w:r>
+        <w:rPr>
+          <w:rFonts w:hint="default"/>
+          <w:lang w:val="en-US"/>
+        </w:rPr>
+        <w:t xml:space="preserve">Try + </w:t>
+      </w:r>
+      <w:r>
+        <w:rPr>
+          <w:rFonts w:hint="default"/>
+          <w:color w:val="FF0000"/>
+          <w:lang w:val="en-US"/>
+        </w:rPr>
+        <w:t xml:space="preserve">not </w:t>
+      </w:r>
+      <w:r>
+        <w:rPr>
+          <w:rFonts w:hint="default"/>
+          <w:lang w:val="en-US"/>
+        </w:rPr>
+        <w:t>+ to + V</w:t>
+      </w:r>
+    </w:p>
+    <w:p>
+      <w:pPr>
+        <w:numPr>
+          <w:numId w:val="0"/>
+        </w:numPr>
+        <w:ind w:leftChars="0" w:firstLine="720" w:firstLineChars="0"/>
+        <w:rPr>
+          <w:rFonts w:hint="default"/>
+          <w:lang w:val="en-US"/>
+        </w:rPr>
+      </w:pPr>
+      <w:r>
+        <w:rPr>
+          <w:rFonts w:hint="default"/>
+          <w:lang w:val="en-US"/>
+        </w:rPr>
+        <w:t>-&gt; I try not to spend too much money</w:t>
+      </w:r>
+    </w:p>
+    <w:p>
+      <w:pPr>
+        <w:numPr>
+          <w:numId w:val="0"/>
+        </w:numPr>
+        <w:ind w:leftChars="0" w:firstLine="720" w:firstLineChars="0"/>
+        <w:rPr>
+          <w:rFonts w:hint="default"/>
+          <w:lang w:val="en-US"/>
+        </w:rPr>
+      </w:pPr>
+    </w:p>
+    <w:p>
+      <w:pPr>
+        <w:numPr>
+          <w:ilvl w:val="0"/>
+          <w:numId w:val="1"/>
+        </w:numPr>
+        <w:ind w:left="0" w:leftChars="0" w:firstLine="0" w:firstLineChars="0"/>
+        <w:rPr>
+          <w:rFonts w:hint="default"/>
+          <w:lang w:val="en-US"/>
+        </w:rPr>
+      </w:pPr>
+      <w:r>
+        <w:rPr>
+          <w:rFonts w:hint="default"/>
+          <w:lang w:val="en-US"/>
+        </w:rPr>
+        <w:t>Uncountable nouns</w:t>
+      </w:r>
+    </w:p>
+    <w:p>
+      <w:pPr>
+        <w:numPr>
+          <w:numId w:val="0"/>
+        </w:numPr>
+        <w:ind w:leftChars="0"/>
+        <w:rPr>
+          <w:rFonts w:hint="default"/>
+          <w:lang w:val="en-US"/>
+        </w:rPr>
+      </w:pPr>
+      <w:r>
+        <w:rPr>
+          <w:rFonts w:hint="default"/>
+          <w:lang w:val="en-US"/>
+        </w:rPr>
+        <w:t>- waste = garbage</w:t>
+      </w:r>
+    </w:p>
+    <w:p>
+      <w:pPr>
+        <w:numPr>
+          <w:numId w:val="0"/>
+        </w:numPr>
+        <w:ind w:leftChars="0"/>
+        <w:rPr>
+          <w:rFonts w:hint="default"/>
+          <w:lang w:val="en-US"/>
+        </w:rPr>
+      </w:pPr>
+      <w:r>
+        <w:rPr>
+          <w:rFonts w:hint="default"/>
+          <w:lang w:val="en-US"/>
+        </w:rPr>
+        <w:t>- Luggage = baggage</w:t>
+      </w:r>
+    </w:p>
+    <w:p>
+      <w:pPr>
+        <w:numPr>
+          <w:numId w:val="0"/>
+        </w:numPr>
+        <w:ind w:leftChars="0"/>
+        <w:rPr>
+          <w:rFonts w:hint="default"/>
+          <w:lang w:val="en-US"/>
+        </w:rPr>
+      </w:pPr>
+      <w:r>
+        <w:rPr>
+          <w:rFonts w:hint="default"/>
+          <w:lang w:val="en-US"/>
+        </w:rPr>
+        <w:t>- homework</w:t>
+      </w:r>
+    </w:p>
+    <w:p>
+      <w:pPr>
+        <w:numPr>
+          <w:numId w:val="0"/>
+        </w:numPr>
+        <w:ind w:leftChars="0"/>
+        <w:rPr>
+          <w:rFonts w:hint="default"/>
+          <w:lang w:val="en-US"/>
+        </w:rPr>
+      </w:pPr>
+      <w:r>
+        <w:rPr>
+          <w:rFonts w:hint="default"/>
+          <w:lang w:val="en-US"/>
+        </w:rPr>
+        <w:t>- work</w:t>
+      </w:r>
+    </w:p>
+    <w:p>
+      <w:pPr>
+        <w:numPr>
+          <w:numId w:val="0"/>
+        </w:numPr>
+        <w:ind w:leftChars="0"/>
+        <w:rPr>
+          <w:rFonts w:hint="default"/>
+          <w:lang w:val="en-US"/>
+        </w:rPr>
+      </w:pPr>
+      <w:r>
+        <w:rPr>
+          <w:rFonts w:hint="default"/>
+          <w:lang w:val="en-US"/>
+        </w:rPr>
+        <w:t>- news</w:t>
+      </w:r>
+    </w:p>
+    <w:p>
+      <w:pPr>
+        <w:numPr>
+          <w:numId w:val="0"/>
+        </w:numPr>
+        <w:ind w:leftChars="0"/>
+        <w:rPr>
+          <w:rFonts w:hint="default"/>
+          <w:lang w:val="en-US"/>
+        </w:rPr>
+      </w:pPr>
+      <w:r>
+        <w:rPr>
+          <w:rFonts w:hint="default"/>
+          <w:lang w:val="en-US"/>
+        </w:rPr>
+        <w:t>- progress</w:t>
+      </w:r>
+    </w:p>
+    <w:p>
+      <w:pPr>
+        <w:numPr>
+          <w:numId w:val="0"/>
+        </w:numPr>
+        <w:ind w:leftChars="0"/>
+        <w:rPr>
+          <w:rFonts w:hint="default"/>
+          <w:lang w:val="en-US"/>
+        </w:rPr>
+      </w:pPr>
+      <w:r>
+        <w:rPr>
+          <w:rFonts w:hint="default"/>
+          <w:lang w:val="en-US"/>
+        </w:rPr>
+        <w:t xml:space="preserve">- </w:t>
+      </w:r>
+      <w:r>
+        <w:rPr>
+          <w:rFonts w:hint="default"/>
+          <w:color w:val="FF0000"/>
+          <w:lang w:val="en-US"/>
+        </w:rPr>
+        <w:t>behaviour</w:t>
+      </w:r>
+    </w:p>
+    <w:p>
+      <w:pPr>
+        <w:numPr>
+          <w:numId w:val="0"/>
+        </w:numPr>
+        <w:ind w:leftChars="0"/>
+        <w:rPr>
+          <w:rFonts w:hint="default"/>
+          <w:lang w:val="en-US"/>
+        </w:rPr>
+      </w:pPr>
+      <w:r>
+        <w:rPr>
+          <w:rFonts w:hint="default"/>
+          <w:lang w:val="en-US"/>
+        </w:rPr>
+        <w:t xml:space="preserve">- </w:t>
+      </w:r>
+      <w:r>
+        <w:rPr>
+          <w:rFonts w:hint="default"/>
+          <w:color w:val="FF0000"/>
+          <w:lang w:val="en-US"/>
+        </w:rPr>
+        <w:t>accommodation</w:t>
+      </w:r>
+    </w:p>
+    <w:p>
+      <w:pPr>
+        <w:numPr>
+          <w:numId w:val="0"/>
+        </w:numPr>
+        <w:ind w:leftChars="0"/>
+        <w:rPr>
+          <w:rFonts w:hint="default"/>
+          <w:lang w:val="en-US"/>
+        </w:rPr>
+      </w:pPr>
+      <w:r>
+        <w:rPr>
+          <w:rFonts w:hint="default"/>
+          <w:lang w:val="en-US"/>
+        </w:rPr>
+        <w:t xml:space="preserve">- </w:t>
+      </w:r>
+      <w:r>
+        <w:rPr>
+          <w:rFonts w:hint="default"/>
+          <w:color w:val="FF0000"/>
+          <w:lang w:val="en-US"/>
+        </w:rPr>
+        <w:t>software</w:t>
+      </w:r>
+    </w:p>
+    <w:p>
+      <w:pPr>
+        <w:numPr>
+          <w:numId w:val="0"/>
+        </w:numPr>
+        <w:ind w:leftChars="0"/>
+        <w:rPr>
+          <w:rFonts w:hint="default"/>
+          <w:lang w:val="en-US"/>
+        </w:rPr>
+      </w:pPr>
+      <w:r>
+        <w:rPr>
+          <w:rFonts w:hint="default"/>
+          <w:lang w:val="en-US"/>
+        </w:rPr>
+        <w:t xml:space="preserve">- </w:t>
+      </w:r>
+      <w:r>
+        <w:rPr>
+          <w:rFonts w:hint="default"/>
+          <w:color w:val="FF0000"/>
+          <w:lang w:val="en-US"/>
+        </w:rPr>
+        <w:t>hardware</w:t>
+      </w:r>
+    </w:p>
+    <w:p>
+      <w:pPr>
+        <w:numPr>
+          <w:numId w:val="0"/>
+        </w:numPr>
+        <w:ind w:leftChars="0"/>
+        <w:rPr>
+          <w:rFonts w:hint="default"/>
+          <w:lang w:val="en-US"/>
+        </w:rPr>
+      </w:pPr>
+      <w:r>
+        <w:rPr>
+          <w:rFonts w:hint="default"/>
+          <w:lang w:val="en-US"/>
+        </w:rPr>
+        <w:t>- funding</w:t>
+      </w:r>
+    </w:p>
+    <w:p>
+      <w:pPr>
+        <w:numPr>
+          <w:numId w:val="0"/>
+        </w:numPr>
+        <w:ind w:leftChars="0"/>
+        <w:rPr>
+          <w:rFonts w:hint="default"/>
+          <w:lang w:val="en-US"/>
+        </w:rPr>
+      </w:pPr>
+      <w:r>
+        <w:rPr>
+          <w:rFonts w:hint="default"/>
+          <w:lang w:val="en-US"/>
+        </w:rPr>
+        <w:t xml:space="preserve">- </w:t>
+      </w:r>
+      <w:r>
+        <w:rPr>
+          <w:rFonts w:hint="default"/>
+          <w:color w:val="FF0000"/>
+          <w:lang w:val="en-US"/>
+        </w:rPr>
+        <w:t>infrastructure</w:t>
+      </w:r>
+    </w:p>
+    <w:p>
+      <w:pPr>
+        <w:numPr>
+          <w:numId w:val="0"/>
+        </w:numPr>
+        <w:ind w:leftChars="0"/>
+        <w:rPr>
+          <w:rFonts w:hint="default"/>
+          <w:lang w:val="en-US"/>
+        </w:rPr>
+      </w:pPr>
+      <w:r>
+        <w:rPr>
+          <w:rFonts w:hint="default"/>
+          <w:lang w:val="en-US"/>
+        </w:rPr>
+        <w:t xml:space="preserve">- </w:t>
+      </w:r>
+      <w:r>
+        <w:rPr>
+          <w:rFonts w:hint="default"/>
+          <w:color w:val="FF0000"/>
+          <w:lang w:val="en-US"/>
+        </w:rPr>
+        <w:t>harm</w:t>
+      </w:r>
+    </w:p>
+    <w:p>
+      <w:pPr>
+        <w:numPr>
+          <w:numId w:val="0"/>
+        </w:numPr>
+        <w:ind w:leftChars="0"/>
+        <w:rPr>
+          <w:rFonts w:hint="default"/>
+          <w:lang w:val="en-US"/>
+        </w:rPr>
+      </w:pPr>
+      <w:r>
+        <w:rPr>
+          <w:rFonts w:hint="default"/>
+          <w:lang w:val="en-US"/>
+        </w:rPr>
+        <w:t>- education</w:t>
+      </w:r>
+    </w:p>
+    <w:p>
+      <w:pPr>
+        <w:numPr>
+          <w:numId w:val="0"/>
+        </w:numPr>
+        <w:pBdr>
+          <w:bottom w:val="single" w:color="auto" w:sz="4" w:space="0"/>
+        </w:pBdr>
+        <w:ind w:leftChars="0"/>
+        <w:rPr>
+          <w:rFonts w:hint="default"/>
+          <w:lang w:val="en-US"/>
+        </w:rPr>
+      </w:pPr>
+    </w:p>
+    <w:p>
+      <w:pPr>
+        <w:numPr>
+          <w:numId w:val="0"/>
+        </w:numPr>
+        <w:ind w:leftChars="0"/>
+        <w:rPr>
+          <w:rFonts w:hint="default"/>
+          <w:lang w:val="en-US"/>
+        </w:rPr>
+      </w:pPr>
+    </w:p>
+    <w:p>
+      <w:pPr>
+        <w:numPr>
+          <w:numId w:val="0"/>
+        </w:numPr>
+        <w:ind w:leftChars="0"/>
+        <w:rPr>
+          <w:rFonts w:hint="default"/>
+          <w:lang w:val="en-US"/>
+        </w:rPr>
+      </w:pPr>
+    </w:p>
+    <w:p>
+      <w:pPr>
+        <w:numPr>
+          <w:numId w:val="0"/>
+        </w:numPr>
+        <w:ind w:leftChars="0"/>
+        <w:rPr>
+          <w:rFonts w:hint="default"/>
+          <w:lang w:val="en-US"/>
+        </w:rPr>
+      </w:pPr>
+    </w:p>
+    <w:p>
+      <w:pPr>
+        <w:numPr>
+          <w:numId w:val="0"/>
+        </w:numPr>
+        <w:ind w:leftChars="0"/>
+        <w:rPr>
+          <w:rFonts w:hint="default"/>
+          <w:lang w:val="en-US"/>
+        </w:rPr>
+      </w:pPr>
+    </w:p>
+    <w:p>
+      <w:pPr>
+        <w:numPr>
+          <w:numId w:val="0"/>
+        </w:numPr>
+        <w:ind w:leftChars="0"/>
+        <w:rPr>
+          <w:rFonts w:hint="default"/>
+          <w:lang w:val="en-US"/>
+        </w:rPr>
+      </w:pPr>
+    </w:p>
+    <w:p>
+      <w:pPr>
+        <w:numPr>
+          <w:numId w:val="0"/>
+        </w:numPr>
+        <w:ind w:leftChars="0"/>
+        <w:rPr>
+          <w:rFonts w:hint="default"/>
+          <w:lang w:val="en-US"/>
+        </w:rPr>
+      </w:pPr>
+    </w:p>
+    <w:p>
+      <w:pPr>
+        <w:numPr>
+          <w:numId w:val="0"/>
+        </w:numPr>
+        <w:ind w:leftChars="0"/>
+        <w:rPr>
+          <w:rFonts w:hint="default"/>
+          <w:lang w:val="en-US"/>
+        </w:rPr>
+      </w:pPr>
+    </w:p>
+    <w:p>
+      <w:pPr>
+        <w:numPr>
+          <w:numId w:val="0"/>
+        </w:numPr>
+        <w:ind w:leftChars="0"/>
+        <w:rPr>
+          <w:rFonts w:hint="default"/>
+          <w:lang w:val="en-US"/>
+        </w:rPr>
+      </w:pPr>
+    </w:p>
+    <w:p>
+      <w:pPr>
+        <w:numPr>
+          <w:numId w:val="0"/>
+        </w:numPr>
+        <w:ind w:leftChars="0"/>
+        <w:rPr>
+          <w:rFonts w:hint="default"/>
+          <w:lang w:val="en-US"/>
+        </w:rPr>
+      </w:pPr>
+    </w:p>
+    <w:p>
+      <w:pPr>
+        <w:numPr>
+          <w:numId w:val="0"/>
+        </w:numPr>
+        <w:rPr>
+          <w:rFonts w:hint="default"/>
+          <w:lang w:val="en-US"/>
+        </w:rPr>
+      </w:pPr>
       <w:bookmarkStart w:id="0" w:name="_GoBack"/>
       <w:bookmarkEnd w:id="0"/>
+    </w:p>
+    <w:p>
+      <w:pPr>
+        <w:numPr>
+          <w:numId w:val="0"/>
+        </w:numPr>
+        <w:rPr>
+          <w:rFonts w:hint="default"/>
+          <w:lang w:val="en-US"/>
+        </w:rPr>
+      </w:pPr>
+    </w:p>
+    <w:p>
+      <w:pPr>
+        <w:numPr>
+          <w:numId w:val="0"/>
+        </w:numPr>
+        <w:rPr>
+          <w:rFonts w:hint="default"/>
+          <w:lang w:val="en-US"/>
+        </w:rPr>
+      </w:pPr>
+    </w:p>
+    <w:p>
+      <w:pPr>
+        <w:numPr>
+          <w:numId w:val="0"/>
+        </w:numPr>
+        <w:rPr>
+          <w:rFonts w:hint="default"/>
+          <w:lang w:val="en-US"/>
+        </w:rPr>
+      </w:pPr>
+    </w:p>
+    <w:p>
+      <w:pPr>
+        <w:numPr>
+          <w:numId w:val="0"/>
+        </w:numPr>
+        <w:rPr>
+          <w:rFonts w:hint="default"/>
+          <w:lang w:val="en-US"/>
+        </w:rPr>
+      </w:pPr>
+    </w:p>
+    <w:p>
+      <w:pPr>
+        <w:numPr>
+          <w:numId w:val="0"/>
+        </w:numPr>
+        <w:rPr>
+          <w:rFonts w:hint="default"/>
+          <w:lang w:val="en-US"/>
+        </w:rPr>
+      </w:pPr>
+    </w:p>
+    <w:p>
+      <w:pPr>
+        <w:numPr>
+          <w:numId w:val="0"/>
+        </w:numPr>
+        <w:rPr>
+          <w:rFonts w:hint="default"/>
+          <w:lang w:val="en-US"/>
+        </w:rPr>
+      </w:pPr>
+    </w:p>
+    <w:p>
+      <w:pPr>
+        <w:numPr>
+          <w:numId w:val="0"/>
+        </w:numPr>
+        <w:rPr>
+          <w:rFonts w:hint="default"/>
+          <w:lang w:val="en-US"/>
+        </w:rPr>
+      </w:pPr>
+    </w:p>
+    <w:p>
+      <w:pPr>
+        <w:numPr>
+          <w:numId w:val="0"/>
+        </w:numPr>
+        <w:rPr>
+          <w:rFonts w:hint="default"/>
+          <w:lang w:val="en-US"/>
+        </w:rPr>
+      </w:pPr>
+    </w:p>
+    <w:p>
+      <w:pPr>
+        <w:numPr>
+          <w:numId w:val="0"/>
+        </w:numPr>
+        <w:rPr>
+          <w:rFonts w:hint="default"/>
+          <w:lang w:val="en-US"/>
+        </w:rPr>
+      </w:pPr>
+    </w:p>
+    <w:p>
+      <w:pPr>
+        <w:numPr>
+          <w:numId w:val="0"/>
+        </w:numPr>
+        <w:rPr>
+          <w:rFonts w:hint="default"/>
+          <w:lang w:val="en-US"/>
+        </w:rPr>
+      </w:pPr>
+    </w:p>
+    <w:p>
+      <w:pPr>
+        <w:numPr>
+          <w:numId w:val="0"/>
+        </w:numPr>
+        <w:rPr>
+          <w:rFonts w:hint="default"/>
+          <w:lang w:val="en-US"/>
+        </w:rPr>
+      </w:pPr>
+    </w:p>
+    <w:p>
+      <w:pPr>
+        <w:numPr>
+          <w:numId w:val="0"/>
+        </w:numPr>
+        <w:rPr>
+          <w:rFonts w:hint="default"/>
+          <w:lang w:val="en-US"/>
+        </w:rPr>
+      </w:pPr>
+    </w:p>
+    <w:p>
+      <w:pPr>
+        <w:numPr>
+          <w:numId w:val="0"/>
+        </w:numPr>
+        <w:rPr>
+          <w:rFonts w:hint="default"/>
+          <w:lang w:val="en-US"/>
+        </w:rPr>
+      </w:pPr>
+    </w:p>
+    <w:p>
+      <w:pPr>
+        <w:numPr>
+          <w:numId w:val="0"/>
+        </w:numPr>
+        <w:rPr>
+          <w:rFonts w:hint="default"/>
+          <w:lang w:val="en-US"/>
+        </w:rPr>
+      </w:pPr>
+    </w:p>
+    <w:p>
+      <w:pPr>
+        <w:numPr>
+          <w:numId w:val="0"/>
+        </w:numPr>
+        <w:rPr>
+          <w:rFonts w:hint="default"/>
+          <w:lang w:val="en-US"/>
+        </w:rPr>
+      </w:pPr>
+    </w:p>
+    <w:p>
+      <w:pPr>
+        <w:numPr>
+          <w:numId w:val="0"/>
+        </w:numPr>
+        <w:rPr>
+          <w:rFonts w:hint="default"/>
+          <w:lang w:val="en-US"/>
+        </w:rPr>
+      </w:pPr>
+    </w:p>
+    <w:p>
+      <w:pPr>
+        <w:numPr>
+          <w:numId w:val="0"/>
+        </w:numPr>
+        <w:rPr>
+          <w:rFonts w:hint="default"/>
+          <w:lang w:val="en-US"/>
+        </w:rPr>
+      </w:pPr>
+    </w:p>
+    <w:p>
+      <w:pPr>
+        <w:numPr>
+          <w:numId w:val="0"/>
+        </w:numPr>
+        <w:rPr>
+          <w:rFonts w:hint="default"/>
+          <w:lang w:val="en-US"/>
+        </w:rPr>
+      </w:pPr>
+    </w:p>
+    <w:p>
+      <w:pPr>
+        <w:numPr>
+          <w:numId w:val="0"/>
+        </w:numPr>
+        <w:rPr>
+          <w:rFonts w:hint="default"/>
+          <w:lang w:val="en-US"/>
+        </w:rPr>
+      </w:pPr>
+    </w:p>
+    <w:p>
+      <w:pPr>
+        <w:numPr>
+          <w:numId w:val="0"/>
+        </w:numPr>
+        <w:rPr>
+          <w:rFonts w:hint="default"/>
+          <w:lang w:val="en-US"/>
+        </w:rPr>
+      </w:pPr>
+    </w:p>
+    <w:p>
+      <w:pPr>
+        <w:numPr>
+          <w:numId w:val="0"/>
+        </w:numPr>
+        <w:rPr>
+          <w:rFonts w:hint="default"/>
+          <w:lang w:val="en-US"/>
+        </w:rPr>
+      </w:pPr>
+    </w:p>
+    <w:p>
+      <w:pPr>
+        <w:numPr>
+          <w:numId w:val="0"/>
+        </w:numPr>
+        <w:rPr>
+          <w:rFonts w:hint="default"/>
+          <w:lang w:val="en-US"/>
+        </w:rPr>
+      </w:pPr>
+    </w:p>
+    <w:p>
+      <w:pPr>
+        <w:numPr>
+          <w:numId w:val="0"/>
+        </w:numPr>
+        <w:rPr>
+          <w:rFonts w:hint="default"/>
+          <w:lang w:val="en-US"/>
+        </w:rPr>
+      </w:pPr>
+    </w:p>
+    <w:p>
+      <w:pPr>
+        <w:numPr>
+          <w:numId w:val="0"/>
+        </w:numPr>
+        <w:rPr>
+          <w:rFonts w:hint="default"/>
+          <w:lang w:val="en-US"/>
+        </w:rPr>
+      </w:pPr>
+    </w:p>
+    <w:p>
+      <w:pPr>
+        <w:numPr>
+          <w:numId w:val="0"/>
+        </w:numPr>
+        <w:rPr>
+          <w:rFonts w:hint="default"/>
+          <w:lang w:val="en-US"/>
+        </w:rPr>
+      </w:pPr>
+    </w:p>
+    <w:p>
+      <w:pPr>
+        <w:numPr>
+          <w:numId w:val="0"/>
+        </w:numPr>
+        <w:rPr>
+          <w:rFonts w:hint="default"/>
+          <w:lang w:val="en-US"/>
+        </w:rPr>
+      </w:pPr>
+    </w:p>
+    <w:p>
+      <w:pPr>
+        <w:numPr>
+          <w:numId w:val="0"/>
+        </w:numPr>
+        <w:rPr>
+          <w:rFonts w:hint="default"/>
+          <w:lang w:val="en-US"/>
+        </w:rPr>
+      </w:pPr>
+    </w:p>
+    <w:p>
+      <w:pPr>
+        <w:numPr>
+          <w:numId w:val="0"/>
+        </w:numPr>
+        <w:rPr>
+          <w:rFonts w:hint="default"/>
+          <w:lang w:val="en-US"/>
+        </w:rPr>
+      </w:pPr>
+    </w:p>
+    <w:p>
+      <w:pPr>
+        <w:numPr>
+          <w:numId w:val="0"/>
+        </w:numPr>
+        <w:rPr>
+          <w:rFonts w:hint="default"/>
+          <w:lang w:val="en-US"/>
+        </w:rPr>
+      </w:pPr>
+    </w:p>
+    <w:p>
+      <w:pPr>
+        <w:numPr>
+          <w:numId w:val="0"/>
+        </w:numPr>
+        <w:pBdr>
+          <w:bottom w:val="single" w:color="auto" w:sz="4" w:space="0"/>
+        </w:pBdr>
+        <w:rPr>
+          <w:rFonts w:hint="default"/>
+          <w:lang w:val="en-US"/>
+        </w:rPr>
+      </w:pPr>
+    </w:p>
+    <w:p>
+      <w:pPr>
+        <w:numPr>
+          <w:numId w:val="0"/>
+        </w:numPr>
+        <w:rPr>
+          <w:rFonts w:hint="default"/>
+          <w:lang w:val="en-US"/>
+        </w:rPr>
+      </w:pPr>
+    </w:p>
+    <w:p>
+      <w:pPr>
+        <w:numPr>
+          <w:ilvl w:val="0"/>
+          <w:numId w:val="2"/>
+        </w:numPr>
+        <w:rPr>
+          <w:rFonts w:hint="default"/>
+          <w:lang w:val="en-US"/>
+        </w:rPr>
+      </w:pPr>
+      <w:r>
+        <w:rPr>
+          <w:rFonts w:hint="default"/>
+          <w:lang w:val="en-US"/>
+        </w:rPr>
+        <w:t>Wreckage</w:t>
+      </w:r>
+    </w:p>
+    <w:p>
+      <w:pPr>
+        <w:numPr>
+          <w:ilvl w:val="0"/>
+          <w:numId w:val="2"/>
+        </w:numPr>
+        <w:rPr>
+          <w:rFonts w:hint="default"/>
+          <w:lang w:val="en-US"/>
+        </w:rPr>
+      </w:pPr>
+      <w:r>
+        <w:rPr>
+          <w:rFonts w:hint="default"/>
+          <w:lang w:val="en-US"/>
+        </w:rPr>
+        <w:t>Abdomen</w:t>
+      </w:r>
+      <w:r>
+        <w:rPr>
+          <w:rFonts w:hint="default"/>
+          <w:lang w:val="en-US"/>
+        </w:rPr>
+        <w:tab/>
+        <w:t/>
+      </w:r>
+      <w:r>
+        <w:rPr>
+          <w:rFonts w:hint="default"/>
+          <w:lang w:val="en-US"/>
+        </w:rPr>
+        <w:tab/>
+        <w:t>- Abdominal</w:t>
+      </w:r>
+    </w:p>
+    <w:p>
+      <w:pPr>
+        <w:numPr>
+          <w:ilvl w:val="0"/>
+          <w:numId w:val="2"/>
+        </w:numPr>
+        <w:rPr>
+          <w:rFonts w:hint="default"/>
+          <w:lang w:val="en-US"/>
+        </w:rPr>
+      </w:pPr>
+      <w:r>
+        <w:rPr>
+          <w:rFonts w:hint="default"/>
+          <w:lang w:val="en-US"/>
+        </w:rPr>
+        <w:t>Alternate</w:t>
+      </w:r>
+    </w:p>
+    <w:p>
+      <w:pPr>
+        <w:numPr>
+          <w:ilvl w:val="0"/>
+          <w:numId w:val="2"/>
+        </w:numPr>
+        <w:rPr>
+          <w:rFonts w:hint="default"/>
+          <w:lang w:val="en-US"/>
+        </w:rPr>
+      </w:pPr>
+      <w:r>
+        <w:rPr>
+          <w:rFonts w:hint="default"/>
+          <w:lang w:val="en-US"/>
+        </w:rPr>
+        <w:t>Apparatus</w:t>
+      </w:r>
+    </w:p>
+    <w:p>
+      <w:pPr>
+        <w:numPr>
+          <w:ilvl w:val="0"/>
+          <w:numId w:val="2"/>
+        </w:numPr>
+        <w:rPr>
+          <w:rFonts w:hint="default"/>
+          <w:lang w:val="en-US"/>
+        </w:rPr>
+      </w:pPr>
+      <w:r>
+        <w:rPr>
+          <w:rFonts w:hint="default"/>
+          <w:lang w:val="en-US"/>
+        </w:rPr>
+        <w:t>Apt</w:t>
+      </w:r>
+    </w:p>
+    <w:p>
+      <w:pPr>
+        <w:numPr>
+          <w:ilvl w:val="0"/>
+          <w:numId w:val="2"/>
+        </w:numPr>
+        <w:rPr>
+          <w:rFonts w:hint="default"/>
+          <w:lang w:val="en-US"/>
+        </w:rPr>
+      </w:pPr>
+      <w:r>
+        <w:rPr>
+          <w:rFonts w:hint="default"/>
+          <w:lang w:val="en-US"/>
+        </w:rPr>
+        <w:t>Briskly</w:t>
+      </w:r>
+    </w:p>
+    <w:p>
+      <w:pPr>
+        <w:numPr>
+          <w:ilvl w:val="0"/>
+          <w:numId w:val="2"/>
+        </w:numPr>
+        <w:rPr>
+          <w:rFonts w:hint="default"/>
+          <w:lang w:val="en-US"/>
+        </w:rPr>
+      </w:pPr>
+      <w:r>
+        <w:rPr>
+          <w:rFonts w:hint="default"/>
+          <w:lang w:val="en-US"/>
+        </w:rPr>
+        <w:t>Controversial</w:t>
+      </w:r>
+    </w:p>
+    <w:p>
+      <w:pPr>
+        <w:numPr>
+          <w:ilvl w:val="0"/>
+          <w:numId w:val="2"/>
+        </w:numPr>
+        <w:rPr>
+          <w:rFonts w:hint="default"/>
+          <w:lang w:val="en-US"/>
+        </w:rPr>
+      </w:pPr>
+      <w:r>
+        <w:rPr>
+          <w:rFonts w:hint="default"/>
+          <w:lang w:val="en-US"/>
+        </w:rPr>
+        <w:t>Curb</w:t>
+      </w:r>
+    </w:p>
+    <w:p>
+      <w:pPr>
+        <w:numPr>
+          <w:ilvl w:val="0"/>
+          <w:numId w:val="2"/>
+        </w:numPr>
+        <w:rPr>
+          <w:rFonts w:hint="default"/>
+          <w:lang w:val="en-US"/>
+        </w:rPr>
+      </w:pPr>
+      <w:r>
+        <w:rPr>
+          <w:rFonts w:hint="default"/>
+          <w:lang w:val="en-US"/>
+        </w:rPr>
+        <w:t>Debilitating</w:t>
+      </w:r>
+    </w:p>
+    <w:p>
+      <w:pPr>
+        <w:numPr>
+          <w:ilvl w:val="0"/>
+          <w:numId w:val="2"/>
+        </w:numPr>
+        <w:rPr>
+          <w:rFonts w:hint="default"/>
+          <w:lang w:val="en-US"/>
+        </w:rPr>
+      </w:pPr>
+      <w:r>
+        <w:rPr>
+          <w:rFonts w:hint="default"/>
+          <w:lang w:val="en-US"/>
+        </w:rPr>
+        <w:t>Stroke</w:t>
+      </w:r>
+    </w:p>
+    <w:p>
+      <w:pPr>
+        <w:numPr>
+          <w:ilvl w:val="0"/>
+          <w:numId w:val="2"/>
+        </w:numPr>
+        <w:rPr>
+          <w:rFonts w:hint="default"/>
+          <w:lang w:val="en-US"/>
+        </w:rPr>
+      </w:pPr>
+      <w:r>
+        <w:rPr>
+          <w:rFonts w:hint="default"/>
+          <w:lang w:val="en-US"/>
+        </w:rPr>
+        <w:t>Insomnia</w:t>
+      </w:r>
+    </w:p>
+    <w:p>
+      <w:pPr>
+        <w:numPr>
+          <w:ilvl w:val="0"/>
+          <w:numId w:val="2"/>
+        </w:numPr>
+        <w:rPr>
+          <w:rFonts w:hint="default"/>
+          <w:lang w:val="en-US"/>
+        </w:rPr>
+      </w:pPr>
+      <w:r>
+        <w:rPr>
+          <w:rFonts w:hint="default"/>
+          <w:lang w:val="en-US"/>
+        </w:rPr>
+        <w:t>Lean</w:t>
+      </w:r>
+    </w:p>
+    <w:p>
+      <w:pPr>
+        <w:numPr>
+          <w:ilvl w:val="0"/>
+          <w:numId w:val="2"/>
+        </w:numPr>
+        <w:rPr>
+          <w:rFonts w:hint="default"/>
+          <w:lang w:val="en-US"/>
+        </w:rPr>
+      </w:pPr>
+      <w:r>
+        <w:rPr>
+          <w:rFonts w:hint="default"/>
+          <w:lang w:val="en-US"/>
+        </w:rPr>
+        <w:t>Marital</w:t>
+      </w:r>
+    </w:p>
+    <w:p>
+      <w:pPr>
+        <w:numPr>
+          <w:ilvl w:val="0"/>
+          <w:numId w:val="2"/>
+        </w:numPr>
+        <w:rPr>
+          <w:rFonts w:hint="default"/>
+          <w:lang w:val="en-US"/>
+        </w:rPr>
+      </w:pPr>
+      <w:r>
+        <w:rPr>
+          <w:rFonts w:hint="default"/>
+          <w:lang w:val="en-US"/>
+        </w:rPr>
+        <w:t>Onset</w:t>
+      </w:r>
+    </w:p>
+    <w:p>
+      <w:pPr>
+        <w:numPr>
+          <w:ilvl w:val="0"/>
+          <w:numId w:val="2"/>
+        </w:numPr>
+        <w:rPr>
+          <w:rFonts w:hint="default"/>
+          <w:lang w:val="en-US"/>
+        </w:rPr>
+      </w:pPr>
+      <w:r>
+        <w:rPr>
+          <w:rFonts w:hint="default"/>
+          <w:lang w:val="en-US"/>
+        </w:rPr>
+        <w:t>Predisposition</w:t>
+      </w:r>
+    </w:p>
+    <w:p>
+      <w:pPr>
+        <w:numPr>
+          <w:ilvl w:val="0"/>
+          <w:numId w:val="2"/>
+        </w:numPr>
+        <w:rPr>
+          <w:rFonts w:hint="default"/>
+          <w:lang w:val="en-US"/>
+        </w:rPr>
+      </w:pPr>
+      <w:r>
+        <w:rPr>
+          <w:rFonts w:hint="default"/>
+          <w:lang w:val="en-US"/>
+        </w:rPr>
+        <w:t>Suicide</w:t>
+      </w:r>
+      <w:r>
+        <w:rPr>
+          <w:rFonts w:hint="default"/>
+          <w:lang w:val="en-US"/>
+        </w:rPr>
+        <w:tab/>
+        <w:t/>
+      </w:r>
+      <w:r>
+        <w:rPr>
+          <w:rFonts w:hint="default"/>
+          <w:lang w:val="en-US"/>
+        </w:rPr>
+        <w:tab/>
+        <w:t/>
+      </w:r>
+      <w:r>
+        <w:rPr>
+          <w:rFonts w:hint="default"/>
+          <w:lang w:val="en-US"/>
+        </w:rPr>
+        <w:tab/>
+        <w:t>- suicidal</w:t>
+      </w:r>
+      <w:r>
+        <w:rPr>
+          <w:rFonts w:hint="default"/>
+          <w:lang w:val="en-US"/>
+        </w:rPr>
+        <w:tab/>
+      </w:r>
+    </w:p>
+    <w:p>
+      <w:pPr>
+        <w:numPr>
+          <w:ilvl w:val="0"/>
+          <w:numId w:val="2"/>
+        </w:numPr>
+        <w:rPr>
+          <w:rFonts w:hint="default"/>
+          <w:lang w:val="en-US"/>
+        </w:rPr>
+      </w:pPr>
+      <w:r>
+        <w:rPr>
+          <w:rFonts w:hint="default"/>
+          <w:lang w:val="en-US"/>
+        </w:rPr>
+        <w:t>Tempt</w:t>
+      </w:r>
+      <w:r>
+        <w:rPr>
+          <w:rFonts w:hint="default"/>
+          <w:lang w:val="en-US"/>
+        </w:rPr>
+        <w:tab/>
+        <w:t/>
+      </w:r>
+      <w:r>
+        <w:rPr>
+          <w:rFonts w:hint="default"/>
+          <w:lang w:val="en-US"/>
+        </w:rPr>
+        <w:tab/>
+        <w:t/>
+      </w:r>
+      <w:r>
+        <w:rPr>
+          <w:rFonts w:hint="default"/>
+          <w:lang w:val="en-US"/>
+        </w:rPr>
+        <w:tab/>
+        <w:t>- temptation</w:t>
+      </w:r>
+    </w:p>
+    <w:p>
+      <w:pPr>
+        <w:numPr>
+          <w:ilvl w:val="0"/>
+          <w:numId w:val="2"/>
+        </w:numPr>
+        <w:rPr>
+          <w:rFonts w:hint="default"/>
+          <w:lang w:val="en-US"/>
+        </w:rPr>
+      </w:pPr>
+      <w:r>
+        <w:rPr>
+          <w:rFonts w:hint="default"/>
+          <w:lang w:val="en-US"/>
+        </w:rPr>
+        <w:t>Transplant</w:t>
+      </w:r>
+    </w:p>
+    <w:p>
+      <w:pPr>
+        <w:numPr>
+          <w:ilvl w:val="0"/>
+          <w:numId w:val="2"/>
+        </w:numPr>
+        <w:rPr>
+          <w:rFonts w:hint="default"/>
+          <w:lang w:val="en-US"/>
+        </w:rPr>
+      </w:pPr>
+      <w:r>
+        <w:rPr>
+          <w:rFonts w:hint="default"/>
+          <w:lang w:val="en-US"/>
+        </w:rPr>
+        <w:t>Pat</w:t>
+      </w:r>
+    </w:p>
+    <w:p>
+      <w:pPr>
+        <w:numPr>
+          <w:ilvl w:val="0"/>
+          <w:numId w:val="2"/>
+        </w:numPr>
+        <w:rPr>
+          <w:rFonts w:hint="default"/>
+          <w:lang w:val="en-US"/>
+        </w:rPr>
+      </w:pPr>
+      <w:r>
+        <w:rPr>
+          <w:rFonts w:hint="default"/>
+          <w:lang w:val="en-US"/>
+        </w:rPr>
+        <w:t>Rub</w:t>
+      </w:r>
+    </w:p>
+    <w:p>
+      <w:pPr>
+        <w:numPr>
+          <w:numId w:val="0"/>
+        </w:numPr>
+        <w:rPr>
+          <w:rFonts w:hint="default"/>
+          <w:lang w:val="en-US"/>
+        </w:rPr>
+      </w:pPr>
+    </w:p>
+    <w:p>
+      <w:pPr>
+        <w:numPr>
+          <w:numId w:val="0"/>
+        </w:numPr>
+        <w:pBdr>
+          <w:bottom w:val="single" w:color="auto" w:sz="4" w:space="0"/>
+        </w:pBdr>
+        <w:rPr>
+          <w:rFonts w:hint="default"/>
+          <w:lang w:val="en-US"/>
+        </w:rPr>
+      </w:pPr>
+    </w:p>
+    <w:p>
+      <w:pPr>
+        <w:numPr>
+          <w:numId w:val="0"/>
+        </w:numPr>
+        <w:rPr>
+          <w:rFonts w:hint="default"/>
+          <w:lang w:val="en-US"/>
+        </w:rPr>
+      </w:pPr>
+    </w:p>
+    <w:p>
+      <w:pPr>
+        <w:numPr>
+          <w:numId w:val="0"/>
+        </w:numPr>
+        <w:rPr>
+          <w:rFonts w:hint="default"/>
+          <w:lang w:val="en-US"/>
+        </w:rPr>
+      </w:pPr>
     </w:p>
     <w:sectPr>
       <w:pgSz w:w="11906" w:h="16838"/>
@@ -297,8 +1739,23 @@
       <w:lvlJc w:val="left"/>
     </w:lvl>
   </w:abstractNum>
+  <w:abstractNum w:abstractNumId="1">
+    <w:nsid w:val="E4CF6FC8"/>
+    <w:multiLevelType w:val="singleLevel"/>
+    <w:tmpl w:val="E4CF6FC8"/>
+    <w:lvl w:ilvl="0" w:tentative="0">
+      <w:start w:val="1"/>
+      <w:numFmt w:val="decimal"/>
+      <w:suff w:val="space"/>
+      <w:lvlText w:val="%1."/>
+      <w:lvlJc w:val="left"/>
+    </w:lvl>
+  </w:abstractNum>
   <w:num w:numId="1">
     <w:abstractNumId w:val="0"/>
+  </w:num>
+  <w:num w:numId="2">
+    <w:abstractNumId w:val="1"/>
   </w:num>
 </w:numbering>
 </file>

</xml_diff>

<commit_message>
add schedule for practicing IELTS
</commit_message>
<xml_diff>
--- a/Vocab_3.docx
+++ b/Vocab_3.docx
@@ -1894,14 +1894,6 @@
         </w:pBdr>
         <w:ind w:left="0" w:leftChars="0" w:firstLine="0" w:firstLineChars="0"/>
         <w:rPr>
-          <w:rFonts w:hint="default" w:ascii="Calibri" w:hAnsi="Calibri" w:cs="Calibri"/>
-          <w:sz w:val="20"/>
-          <w:szCs w:val="20"/>
-          <w:lang w:val="en-US"/>
-        </w:rPr>
-      </w:pPr>
-      <w:r>
-        <w:rPr>
           <w:rFonts w:hint="default" w:ascii="Calibri" w:hAnsi="Calibri" w:eastAsia="Lucida Sans Unicode" w:cs="Calibri"/>
           <w:i w:val="0"/>
           <w:iCs w:val="0"/>
@@ -1913,8 +1905,7 @@
           <w:shd w:val="clear" w:fill="FFFFFF"/>
           <w:lang w:val="en-US"/>
         </w:rPr>
-        <w:t>Invasive surgery</w:t>
-      </w:r>
+      </w:pPr>
       <w:r>
         <w:rPr>
           <w:rFonts w:hint="default" w:ascii="Calibri" w:hAnsi="Calibri" w:eastAsia="Lucida Sans Unicode" w:cs="Calibri"/>
@@ -1928,8 +1919,7 @@
           <w:shd w:val="clear" w:fill="FFFFFF"/>
           <w:lang w:val="en-US"/>
         </w:rPr>
-        <w:tab/>
-        <w:t/>
+        <w:t>Invasive surgery</w:t>
       </w:r>
       <w:r>
         <w:rPr>
@@ -1977,8 +1967,90 @@
           <w:lang w:val="en-US"/>
         </w:rPr>
         <w:tab/>
+        <w:t/>
+      </w:r>
+      <w:r>
+        <w:rPr>
+          <w:rFonts w:hint="default" w:ascii="Calibri" w:hAnsi="Calibri" w:eastAsia="Lucida Sans Unicode" w:cs="Calibri"/>
+          <w:i w:val="0"/>
+          <w:iCs w:val="0"/>
+          <w:caps w:val="0"/>
+          <w:color w:val="333333"/>
+          <w:spacing w:val="0"/>
+          <w:sz w:val="20"/>
+          <w:szCs w:val="20"/>
+          <w:shd w:val="clear" w:fill="FFFFFF"/>
+          <w:lang w:val="en-US"/>
+        </w:rPr>
+        <w:tab/>
         <w:t>- phẫu thuật xâm lấn</w:t>
       </w:r>
+    </w:p>
+    <w:p>
+      <w:pPr>
+        <w:numPr>
+          <w:numId w:val="0"/>
+        </w:numPr>
+        <w:pBdr>
+          <w:bottom w:val="single" w:color="auto" w:sz="4" w:space="0"/>
+        </w:pBdr>
+        <w:rPr>
+          <w:rFonts w:hint="default" w:ascii="Calibri" w:hAnsi="Calibri" w:eastAsia="Lucida Sans Unicode" w:cs="Calibri"/>
+          <w:i w:val="0"/>
+          <w:iCs w:val="0"/>
+          <w:caps w:val="0"/>
+          <w:color w:val="333333"/>
+          <w:spacing w:val="0"/>
+          <w:sz w:val="20"/>
+          <w:szCs w:val="20"/>
+          <w:shd w:val="clear" w:fill="FFFFFF"/>
+          <w:lang w:val="en-US"/>
+        </w:rPr>
+      </w:pPr>
+    </w:p>
+    <w:p>
+      <w:pPr>
+        <w:numPr>
+          <w:numId w:val="0"/>
+        </w:numPr>
+        <w:pBdr>
+          <w:bottom w:val="single" w:color="auto" w:sz="4" w:space="0"/>
+        </w:pBdr>
+        <w:rPr>
+          <w:rFonts w:hint="default" w:ascii="Calibri" w:hAnsi="Calibri" w:eastAsia="Lucida Sans Unicode" w:cs="Calibri"/>
+          <w:i w:val="0"/>
+          <w:iCs w:val="0"/>
+          <w:caps w:val="0"/>
+          <w:color w:val="333333"/>
+          <w:spacing w:val="0"/>
+          <w:sz w:val="20"/>
+          <w:szCs w:val="20"/>
+          <w:shd w:val="clear" w:fill="FFFFFF"/>
+          <w:lang w:val="en-US"/>
+        </w:rPr>
+      </w:pPr>
+    </w:p>
+    <w:p>
+      <w:pPr>
+        <w:numPr>
+          <w:numId w:val="0"/>
+        </w:numPr>
+        <w:pBdr>
+          <w:bottom w:val="none" w:color="auto" w:sz="0" w:space="0"/>
+        </w:pBdr>
+        <w:rPr>
+          <w:rFonts w:hint="default" w:ascii="Calibri" w:hAnsi="Calibri" w:eastAsia="Lucida Sans Unicode" w:cs="Calibri"/>
+          <w:i w:val="0"/>
+          <w:iCs w:val="0"/>
+          <w:caps w:val="0"/>
+          <w:color w:val="333333"/>
+          <w:spacing w:val="0"/>
+          <w:sz w:val="20"/>
+          <w:szCs w:val="20"/>
+          <w:shd w:val="clear" w:fill="FFFFFF"/>
+          <w:lang w:val="en-US"/>
+        </w:rPr>
+      </w:pPr>
     </w:p>
     <w:p>
       <w:pPr>
@@ -1991,14 +2063,247 @@
         </w:pBdr>
         <w:ind w:left="0" w:leftChars="0" w:firstLine="0" w:firstLineChars="0"/>
         <w:rPr>
-          <w:rFonts w:hint="default" w:ascii="Calibri" w:hAnsi="Calibri" w:cs="Calibri"/>
-          <w:sz w:val="20"/>
-          <w:szCs w:val="20"/>
+          <w:rFonts w:hint="default" w:ascii="Calibri" w:hAnsi="Calibri" w:eastAsia="Lucida Sans Unicode" w:cs="Calibri"/>
+          <w:i w:val="0"/>
+          <w:iCs w:val="0"/>
+          <w:caps w:val="0"/>
+          <w:color w:val="333333"/>
+          <w:spacing w:val="0"/>
+          <w:sz w:val="20"/>
+          <w:szCs w:val="20"/>
+          <w:shd w:val="clear" w:fill="FFFFFF"/>
+          <w:lang w:val="en-US"/>
+        </w:rPr>
+      </w:pPr>
+      <w:r>
+        <w:rPr>
+          <w:rFonts w:hint="default" w:ascii="Calibri" w:hAnsi="Calibri" w:eastAsia="Lucida Sans Unicode" w:cs="Calibri"/>
+          <w:i w:val="0"/>
+          <w:iCs w:val="0"/>
+          <w:caps w:val="0"/>
+          <w:color w:val="333333"/>
+          <w:spacing w:val="0"/>
+          <w:sz w:val="20"/>
+          <w:szCs w:val="20"/>
+          <w:shd w:val="clear" w:fill="FFFFFF"/>
+          <w:lang w:val="en-US"/>
+        </w:rPr>
+        <w:t>Amateur # professional</w:t>
+      </w:r>
+    </w:p>
+    <w:p>
+      <w:pPr>
+        <w:numPr>
+          <w:numId w:val="0"/>
+        </w:numPr>
+        <w:pBdr>
+          <w:bottom w:val="single" w:color="auto" w:sz="4" w:space="0"/>
+        </w:pBdr>
+        <w:ind w:leftChars="0"/>
+      </w:pPr>
+      <w:r>
+        <w:drawing>
+          <wp:inline distT="0" distB="0" distL="114300" distR="114300">
+            <wp:extent cx="3136265" cy="1262380"/>
+            <wp:effectExtent l="0" t="0" r="3175" b="2540"/>
+            <wp:docPr id="6" name="Picture 6"/>
+            <wp:cNvGraphicFramePr>
+              <a:graphicFrameLocks xmlns:a="http://schemas.openxmlformats.org/drawingml/2006/main" noChangeAspect="1"/>
+            </wp:cNvGraphicFramePr>
+            <a:graphic xmlns:a="http://schemas.openxmlformats.org/drawingml/2006/main">
+              <a:graphicData uri="http://schemas.openxmlformats.org/drawingml/2006/picture">
+                <pic:pic xmlns:pic="http://schemas.openxmlformats.org/drawingml/2006/picture">
+                  <pic:nvPicPr>
+                    <pic:cNvPr id="6" name="Picture 6"/>
+                    <pic:cNvPicPr>
+                      <a:picLocks noChangeAspect="1"/>
+                    </pic:cNvPicPr>
+                  </pic:nvPicPr>
+                  <pic:blipFill>
+                    <a:blip r:embed="rId8"/>
+                    <a:stretch>
+                      <a:fillRect/>
+                    </a:stretch>
+                  </pic:blipFill>
+                  <pic:spPr>
+                    <a:xfrm>
+                      <a:off x="0" y="0"/>
+                      <a:ext cx="3136265" cy="1262380"/>
+                    </a:xfrm>
+                    <a:prstGeom prst="rect">
+                      <a:avLst/>
+                    </a:prstGeom>
+                    <a:noFill/>
+                    <a:ln>
+                      <a:noFill/>
+                    </a:ln>
+                  </pic:spPr>
+                </pic:pic>
+              </a:graphicData>
+            </a:graphic>
+          </wp:inline>
+        </w:drawing>
+      </w:r>
+    </w:p>
+    <w:p>
+      <w:pPr>
+        <w:numPr>
+          <w:numId w:val="0"/>
+        </w:numPr>
+        <w:pBdr>
+          <w:bottom w:val="single" w:color="auto" w:sz="4" w:space="0"/>
+        </w:pBdr>
+        <w:ind w:leftChars="0"/>
+      </w:pPr>
+    </w:p>
+    <w:p>
+      <w:pPr>
+        <w:numPr>
+          <w:ilvl w:val="0"/>
+          <w:numId w:val="1"/>
+        </w:numPr>
+        <w:pBdr>
+          <w:bottom w:val="single" w:color="auto" w:sz="4" w:space="0"/>
+        </w:pBdr>
+        <w:ind w:left="0" w:leftChars="0" w:firstLine="0" w:firstLineChars="0"/>
+        <w:rPr>
+          <w:rFonts w:hint="default"/>
           <w:lang w:val="en-US"/>
         </w:rPr>
       </w:pPr>
       <w:bookmarkStart w:id="0" w:name="_GoBack"/>
       <w:bookmarkEnd w:id="0"/>
+    </w:p>
+    <w:p>
+      <w:pPr>
+        <w:numPr>
+          <w:numId w:val="0"/>
+        </w:numPr>
+        <w:pBdr>
+          <w:bottom w:val="single" w:color="auto" w:sz="4" w:space="0"/>
+        </w:pBdr>
+        <w:rPr>
+          <w:rFonts w:hint="default" w:ascii="Calibri" w:hAnsi="Calibri" w:eastAsia="Lucida Sans Unicode" w:cs="Calibri"/>
+          <w:i w:val="0"/>
+          <w:iCs w:val="0"/>
+          <w:caps w:val="0"/>
+          <w:color w:val="333333"/>
+          <w:spacing w:val="0"/>
+          <w:sz w:val="20"/>
+          <w:szCs w:val="20"/>
+          <w:shd w:val="clear" w:fill="FFFFFF"/>
+          <w:lang w:val="en-US"/>
+        </w:rPr>
+      </w:pPr>
+    </w:p>
+    <w:p>
+      <w:pPr>
+        <w:numPr>
+          <w:numId w:val="0"/>
+        </w:numPr>
+        <w:pBdr>
+          <w:bottom w:val="none" w:color="auto" w:sz="0" w:space="0"/>
+        </w:pBdr>
+        <w:rPr>
+          <w:rFonts w:hint="default" w:ascii="Calibri" w:hAnsi="Calibri" w:eastAsia="Lucida Sans Unicode" w:cs="Calibri"/>
+          <w:i w:val="0"/>
+          <w:iCs w:val="0"/>
+          <w:caps w:val="0"/>
+          <w:color w:val="333333"/>
+          <w:spacing w:val="0"/>
+          <w:sz w:val="20"/>
+          <w:szCs w:val="20"/>
+          <w:shd w:val="clear" w:fill="FFFFFF"/>
+          <w:lang w:val="en-US"/>
+        </w:rPr>
+      </w:pPr>
+    </w:p>
+    <w:p>
+      <w:pPr>
+        <w:numPr>
+          <w:numId w:val="0"/>
+        </w:numPr>
+        <w:pBdr>
+          <w:bottom w:val="single" w:color="auto" w:sz="4" w:space="0"/>
+        </w:pBdr>
+        <w:rPr>
+          <w:rFonts w:hint="default" w:ascii="Calibri" w:hAnsi="Calibri" w:eastAsia="Lucida Sans Unicode" w:cs="Calibri"/>
+          <w:i w:val="0"/>
+          <w:iCs w:val="0"/>
+          <w:caps w:val="0"/>
+          <w:color w:val="333333"/>
+          <w:spacing w:val="0"/>
+          <w:sz w:val="20"/>
+          <w:szCs w:val="20"/>
+          <w:shd w:val="clear" w:fill="FFFFFF"/>
+          <w:lang w:val="en-US"/>
+        </w:rPr>
+      </w:pPr>
+    </w:p>
+    <w:p>
+      <w:pPr>
+        <w:numPr>
+          <w:numId w:val="0"/>
+        </w:numPr>
+        <w:pBdr>
+          <w:bottom w:val="single" w:color="auto" w:sz="4" w:space="0"/>
+        </w:pBdr>
+        <w:rPr>
+          <w:rFonts w:hint="default" w:ascii="Calibri" w:hAnsi="Calibri" w:eastAsia="Lucida Sans Unicode" w:cs="Calibri"/>
+          <w:i w:val="0"/>
+          <w:iCs w:val="0"/>
+          <w:caps w:val="0"/>
+          <w:color w:val="333333"/>
+          <w:spacing w:val="0"/>
+          <w:sz w:val="20"/>
+          <w:szCs w:val="20"/>
+          <w:shd w:val="clear" w:fill="FFFFFF"/>
+          <w:lang w:val="en-US"/>
+        </w:rPr>
+      </w:pPr>
+      <w:r>
+        <w:drawing>
+          <wp:inline distT="0" distB="0" distL="114300" distR="114300">
+            <wp:extent cx="3191510" cy="2700655"/>
+            <wp:effectExtent l="0" t="0" r="8890" b="12065"/>
+            <wp:docPr id="5" name="Picture 5"/>
+            <wp:cNvGraphicFramePr>
+              <a:graphicFrameLocks xmlns:a="http://schemas.openxmlformats.org/drawingml/2006/main" noChangeAspect="1"/>
+            </wp:cNvGraphicFramePr>
+            <a:graphic xmlns:a="http://schemas.openxmlformats.org/drawingml/2006/main">
+              <a:graphicData uri="http://schemas.openxmlformats.org/drawingml/2006/picture">
+                <pic:pic xmlns:pic="http://schemas.openxmlformats.org/drawingml/2006/picture">
+                  <pic:nvPicPr>
+                    <pic:cNvPr id="5" name="Picture 5"/>
+                    <pic:cNvPicPr>
+                      <a:picLocks noChangeAspect="1"/>
+                    </pic:cNvPicPr>
+                  </pic:nvPicPr>
+                  <pic:blipFill>
+                    <a:blip r:embed="rId9"/>
+                    <a:stretch>
+                      <a:fillRect/>
+                    </a:stretch>
+                  </pic:blipFill>
+                  <pic:spPr>
+                    <a:xfrm>
+                      <a:off x="0" y="0"/>
+                      <a:ext cx="3191510" cy="2700655"/>
+                    </a:xfrm>
+                    <a:prstGeom prst="rect">
+                      <a:avLst/>
+                    </a:prstGeom>
+                    <a:noFill/>
+                    <a:ln>
+                      <a:noFill/>
+                    </a:ln>
+                  </pic:spPr>
+                </pic:pic>
+              </a:graphicData>
+            </a:graphic>
+          </wp:inline>
+        </w:drawing>
+      </w:r>
     </w:p>
     <w:p>
       <w:pPr>

</xml_diff>

<commit_message>
add writing plan based on Vocabulary
</commit_message>
<xml_diff>
--- a/Vocab_3.docx
+++ b/Vocab_3.docx
@@ -2828,6 +2828,90 @@
           <w:lang w:val="en-US"/>
         </w:rPr>
       </w:pPr>
+      <w:r>
+        <w:rPr>
+          <w:rFonts w:hint="default"/>
+          <w:lang w:val="en-US"/>
+        </w:rPr>
+        <w:t xml:space="preserve">Adjective </w:t>
+      </w:r>
+    </w:p>
+    <w:p>
+      <w:pPr>
+        <w:numPr>
+          <w:numId w:val="0"/>
+        </w:numPr>
+        <w:pBdr>
+          <w:bottom w:val="single" w:color="auto" w:sz="4" w:space="0"/>
+        </w:pBdr>
+        <w:ind w:leftChars="0"/>
+      </w:pPr>
+      <w:r>
+        <w:drawing>
+          <wp:inline distT="0" distB="0" distL="114300" distR="114300">
+            <wp:extent cx="2479675" cy="2406015"/>
+            <wp:effectExtent l="0" t="0" r="4445" b="1905"/>
+            <wp:docPr id="13" name="Picture 13"/>
+            <wp:cNvGraphicFramePr>
+              <a:graphicFrameLocks xmlns:a="http://schemas.openxmlformats.org/drawingml/2006/main" noChangeAspect="1"/>
+            </wp:cNvGraphicFramePr>
+            <a:graphic xmlns:a="http://schemas.openxmlformats.org/drawingml/2006/main">
+              <a:graphicData uri="http://schemas.openxmlformats.org/drawingml/2006/picture">
+                <pic:pic xmlns:pic="http://schemas.openxmlformats.org/drawingml/2006/picture">
+                  <pic:nvPicPr>
+                    <pic:cNvPr id="13" name="Picture 13"/>
+                    <pic:cNvPicPr>
+                      <a:picLocks noChangeAspect="1"/>
+                    </pic:cNvPicPr>
+                  </pic:nvPicPr>
+                  <pic:blipFill>
+                    <a:blip r:embed="rId15"/>
+                    <a:stretch>
+                      <a:fillRect/>
+                    </a:stretch>
+                  </pic:blipFill>
+                  <pic:spPr>
+                    <a:xfrm>
+                      <a:off x="0" y="0"/>
+                      <a:ext cx="2479675" cy="2406015"/>
+                    </a:xfrm>
+                    <a:prstGeom prst="rect">
+                      <a:avLst/>
+                    </a:prstGeom>
+                    <a:noFill/>
+                    <a:ln>
+                      <a:noFill/>
+                    </a:ln>
+                  </pic:spPr>
+                </pic:pic>
+              </a:graphicData>
+            </a:graphic>
+          </wp:inline>
+        </w:drawing>
+      </w:r>
+    </w:p>
+    <w:p>
+      <w:pPr>
+        <w:numPr>
+          <w:ilvl w:val="0"/>
+          <w:numId w:val="1"/>
+        </w:numPr>
+        <w:pBdr>
+          <w:bottom w:val="single" w:color="auto" w:sz="4" w:space="0"/>
+        </w:pBdr>
+        <w:ind w:left="0" w:leftChars="0" w:firstLine="0" w:firstLineChars="0"/>
+        <w:rPr>
+          <w:rFonts w:hint="default"/>
+          <w:lang w:val="en-US"/>
+        </w:rPr>
+      </w:pPr>
+      <w:r>
+        <w:rPr>
+          <w:rFonts w:hint="default"/>
+          <w:lang w:val="en-US"/>
+        </w:rPr>
+        <w:t xml:space="preserve">Destroy = Damage = Devastate = Demolish </w:t>
+      </w:r>
       <w:bookmarkStart w:id="0" w:name="_GoBack"/>
       <w:bookmarkEnd w:id="0"/>
     </w:p>
@@ -2884,109 +2968,6 @@
           <w:bottom w:val="single" w:color="auto" w:sz="4" w:space="0"/>
         </w:pBdr>
         <w:ind w:leftChars="0"/>
-      </w:pPr>
-    </w:p>
-    <w:p>
-      <w:pPr>
-        <w:numPr>
-          <w:numId w:val="0"/>
-        </w:numPr>
-        <w:pBdr>
-          <w:bottom w:val="single" w:color="auto" w:sz="4" w:space="0"/>
-        </w:pBdr>
-        <w:ind w:leftChars="0"/>
-      </w:pPr>
-    </w:p>
-    <w:p>
-      <w:pPr>
-        <w:numPr>
-          <w:numId w:val="0"/>
-        </w:numPr>
-        <w:pBdr>
-          <w:bottom w:val="single" w:color="auto" w:sz="4" w:space="0"/>
-        </w:pBdr>
-        <w:ind w:leftChars="0"/>
-      </w:pPr>
-    </w:p>
-    <w:p>
-      <w:pPr>
-        <w:numPr>
-          <w:numId w:val="0"/>
-        </w:numPr>
-        <w:pBdr>
-          <w:bottom w:val="single" w:color="auto" w:sz="4" w:space="0"/>
-        </w:pBdr>
-        <w:ind w:leftChars="0"/>
-      </w:pPr>
-    </w:p>
-    <w:p>
-      <w:pPr>
-        <w:numPr>
-          <w:numId w:val="0"/>
-        </w:numPr>
-        <w:pBdr>
-          <w:bottom w:val="single" w:color="auto" w:sz="4" w:space="0"/>
-        </w:pBdr>
-        <w:ind w:leftChars="0"/>
-      </w:pPr>
-    </w:p>
-    <w:p>
-      <w:pPr>
-        <w:numPr>
-          <w:numId w:val="0"/>
-        </w:numPr>
-        <w:pBdr>
-          <w:bottom w:val="single" w:color="auto" w:sz="4" w:space="0"/>
-        </w:pBdr>
-        <w:ind w:leftChars="0"/>
-      </w:pPr>
-    </w:p>
-    <w:p>
-      <w:pPr>
-        <w:numPr>
-          <w:numId w:val="0"/>
-        </w:numPr>
-        <w:pBdr>
-          <w:bottom w:val="single" w:color="auto" w:sz="4" w:space="0"/>
-        </w:pBdr>
-        <w:ind w:leftChars="0"/>
-      </w:pPr>
-    </w:p>
-    <w:p>
-      <w:pPr>
-        <w:numPr>
-          <w:numId w:val="0"/>
-        </w:numPr>
-        <w:pBdr>
-          <w:bottom w:val="single" w:color="auto" w:sz="4" w:space="0"/>
-        </w:pBdr>
-        <w:ind w:leftChars="0"/>
-        <w:rPr>
-          <w:rFonts w:hint="default"/>
-          <w:lang w:val="en-US"/>
-        </w:rPr>
-      </w:pPr>
-    </w:p>
-    <w:p>
-      <w:pPr>
-        <w:numPr>
-          <w:numId w:val="0"/>
-        </w:numPr>
-        <w:pBdr>
-          <w:bottom w:val="single" w:color="auto" w:sz="4" w:space="0"/>
-        </w:pBdr>
-        <w:rPr>
-          <w:rFonts w:hint="default" w:ascii="Calibri" w:hAnsi="Calibri" w:eastAsia="Lucida Sans Unicode" w:cs="Calibri"/>
-          <w:i w:val="0"/>
-          <w:iCs w:val="0"/>
-          <w:caps w:val="0"/>
-          <w:color w:val="333333"/>
-          <w:spacing w:val="0"/>
-          <w:sz w:val="20"/>
-          <w:szCs w:val="20"/>
-          <w:shd w:val="clear" w:fill="FFFFFF"/>
-          <w:lang w:val="en-US"/>
-        </w:rPr>
       </w:pPr>
     </w:p>
     <w:p>
@@ -3073,7 +3054,7 @@
                     </pic:cNvPicPr>
                   </pic:nvPicPr>
                   <pic:blipFill>
-                    <a:blip r:embed="rId15"/>
+                    <a:blip r:embed="rId16"/>
                     <a:stretch>
                       <a:fillRect/>
                     </a:stretch>

</xml_diff>